<commit_message>
Update demo voice script document
</commit_message>
<xml_diff>
--- a/docs/demo/01-voice-script.docx
+++ b/docs/demo/01-voice-script.docx
@@ -18,13 +18,6 @@
     </w:p>
     <w:p>
       <w:pPr>
-        <w:rPr>
-          <w:rFonts w:asciiTheme="majorHAnsi" w:hAnsiTheme="majorHAnsi" w:cstheme="majorHAnsi"/>
-        </w:rPr>
-      </w:pPr>
-    </w:p>
-    <w:p>
-      <w:pPr>
         <w:pStyle w:val="NormalWeb"/>
         <w:spacing w:before="0" w:beforeAutospacing="0" w:after="0" w:afterAutospacing="0"/>
         <w:rPr>
@@ -150,143 +143,8 @@
           <w:sz w:val="22"/>
           <w:szCs w:val="22"/>
         </w:rPr>
-        <w:t>Segment 2 - Problem</w:t>
-      </w:r>
-    </w:p>
-    <w:p>
-      <w:pPr>
-        <w:pStyle w:val="NormalWeb"/>
-        <w:spacing w:before="0" w:beforeAutospacing="0" w:after="0" w:afterAutospacing="0"/>
-        <w:rPr>
-          <w:rFonts w:asciiTheme="majorHAnsi" w:hAnsiTheme="majorHAnsi" w:cstheme="majorHAnsi"/>
-        </w:rPr>
-      </w:pPr>
-      <w:r>
-        <w:rPr>
-          <w:rFonts w:asciiTheme="majorHAnsi" w:hAnsiTheme="majorHAnsi" w:cstheme="majorHAnsi"/>
-          <w:color w:val="000000"/>
-          <w:sz w:val="22"/>
-          <w:szCs w:val="22"/>
-        </w:rPr>
-        <w:t> </w:t>
-      </w:r>
-    </w:p>
-    <w:p>
-      <w:pPr>
-        <w:pStyle w:val="NormalWeb"/>
-        <w:spacing w:before="0" w:beforeAutospacing="0" w:after="0" w:afterAutospacing="0"/>
-        <w:rPr>
-          <w:rFonts w:asciiTheme="majorHAnsi" w:hAnsiTheme="majorHAnsi" w:cstheme="majorHAnsi"/>
-        </w:rPr>
-      </w:pPr>
-      <w:r>
-        <w:rPr>
-          <w:rFonts w:asciiTheme="majorHAnsi" w:hAnsiTheme="majorHAnsi" w:cstheme="majorHAnsi"/>
-          <w:color w:val="000000"/>
-          <w:sz w:val="22"/>
-          <w:szCs w:val="22"/>
-        </w:rPr>
-        <w:t xml:space="preserve">Teams can see live telemetry, but the strategic questions have changed: Engineers </w:t>
-      </w:r>
-      <w:r>
-        <w:rPr>
-          <w:rFonts w:asciiTheme="majorHAnsi" w:hAnsiTheme="majorHAnsi" w:cstheme="majorHAnsi"/>
-          <w:color w:val="000000"/>
-          <w:sz w:val="22"/>
-          <w:szCs w:val="22"/>
-        </w:rPr>
-        <w:t>must</w:t>
-      </w:r>
-      <w:r>
-        <w:rPr>
-          <w:rFonts w:asciiTheme="majorHAnsi" w:hAnsiTheme="majorHAnsi" w:cstheme="majorHAnsi"/>
-          <w:color w:val="000000"/>
-          <w:sz w:val="22"/>
-          <w:szCs w:val="22"/>
-        </w:rPr>
-        <w:t xml:space="preserve"> decide where to harvest, when to deploy overtake and how to dynamically conserve energy lap by lap.</w:t>
-      </w:r>
-    </w:p>
-    <w:p>
-      <w:pPr>
-        <w:pStyle w:val="NormalWeb"/>
-        <w:spacing w:before="0" w:beforeAutospacing="0" w:after="0" w:afterAutospacing="0"/>
-        <w:rPr>
-          <w:rFonts w:asciiTheme="majorHAnsi" w:hAnsiTheme="majorHAnsi" w:cstheme="majorHAnsi"/>
-        </w:rPr>
-      </w:pPr>
-      <w:r>
-        <w:rPr>
-          <w:rFonts w:asciiTheme="majorHAnsi" w:hAnsiTheme="majorHAnsi" w:cstheme="majorHAnsi"/>
-          <w:color w:val="000000"/>
-          <w:sz w:val="22"/>
-          <w:szCs w:val="22"/>
-        </w:rPr>
-        <w:t> </w:t>
-      </w:r>
-    </w:p>
-    <w:p>
-      <w:pPr>
-        <w:pStyle w:val="NormalWeb"/>
-        <w:spacing w:before="0" w:beforeAutospacing="0" w:after="0" w:afterAutospacing="0"/>
-        <w:rPr>
-          <w:rFonts w:asciiTheme="majorHAnsi" w:hAnsiTheme="majorHAnsi" w:cstheme="majorHAnsi"/>
-        </w:rPr>
-      </w:pPr>
-      <w:r>
-        <w:rPr>
-          <w:rFonts w:asciiTheme="majorHAnsi" w:hAnsiTheme="majorHAnsi" w:cstheme="majorHAnsi"/>
-          <w:color w:val="000000"/>
-          <w:sz w:val="22"/>
-          <w:szCs w:val="22"/>
-        </w:rPr>
-        <w:t>Even broadcaster and fans can not longer easily follow what is happening on the track, because what used to look like “they are just driving fast” now hides an entire chess match in energy management strategy.</w:t>
-      </w:r>
-    </w:p>
-    <w:p>
-      <w:pPr>
-        <w:pStyle w:val="NormalWeb"/>
-        <w:spacing w:before="0" w:beforeAutospacing="0" w:after="0" w:afterAutospacing="0"/>
-        <w:rPr>
-          <w:rFonts w:asciiTheme="majorHAnsi" w:hAnsiTheme="majorHAnsi" w:cstheme="majorHAnsi"/>
-        </w:rPr>
-      </w:pPr>
-      <w:r>
-        <w:rPr>
-          <w:rFonts w:asciiTheme="majorHAnsi" w:hAnsiTheme="majorHAnsi" w:cstheme="majorHAnsi"/>
-          <w:color w:val="000000"/>
-          <w:sz w:val="22"/>
-          <w:szCs w:val="22"/>
-        </w:rPr>
-        <w:t> </w:t>
-      </w:r>
-    </w:p>
-    <w:p>
-      <w:pPr>
-        <w:pStyle w:val="NormalWeb"/>
-        <w:spacing w:before="0" w:beforeAutospacing="0" w:after="0" w:afterAutospacing="0"/>
-        <w:rPr>
-          <w:rFonts w:asciiTheme="majorHAnsi" w:hAnsiTheme="majorHAnsi" w:cstheme="majorHAnsi"/>
-        </w:rPr>
-      </w:pPr>
-      <w:r>
-        <w:rPr>
-          <w:rFonts w:asciiTheme="majorHAnsi" w:hAnsiTheme="majorHAnsi" w:cstheme="majorHAnsi"/>
-          <w:color w:val="000000"/>
-          <w:sz w:val="22"/>
-          <w:szCs w:val="22"/>
-        </w:rPr>
-        <w:t>There is a need for an explainable intelligence layer that translates these energy strategy reasoning into plain language, while grounding every insight of the race in the regulations that shape its decisions.</w:t>
-      </w:r>
-    </w:p>
-    <w:p>
-      <w:pPr>
-        <w:pStyle w:val="NormalWeb"/>
-        <w:spacing w:before="0" w:beforeAutospacing="0" w:after="0" w:afterAutospacing="0"/>
-        <w:rPr>
-          <w:rFonts w:asciiTheme="majorHAnsi" w:hAnsiTheme="majorHAnsi" w:cstheme="majorHAnsi"/>
-        </w:rPr>
-      </w:pPr>
+        <w:t>Segment 2</w:t>
+      </w:r>
       <w:r>
         <w:rPr>
           <w:rFonts w:asciiTheme="majorHAnsi" w:hAnsiTheme="majorHAnsi" w:cstheme="majorHAnsi"/>
@@ -296,17 +154,8 @@
           <w:sz w:val="22"/>
           <w:szCs w:val="22"/>
         </w:rPr>
-        <w:t> </w:t>
-      </w:r>
-    </w:p>
-    <w:p>
-      <w:pPr>
-        <w:pStyle w:val="NormalWeb"/>
-        <w:spacing w:before="0" w:beforeAutospacing="0" w:after="0" w:afterAutospacing="0"/>
-        <w:rPr>
-          <w:rFonts w:asciiTheme="majorHAnsi" w:hAnsiTheme="majorHAnsi" w:cstheme="majorHAnsi"/>
-        </w:rPr>
-      </w:pPr>
+        <w:t>.1</w:t>
+      </w:r>
       <w:r>
         <w:rPr>
           <w:rFonts w:asciiTheme="majorHAnsi" w:hAnsiTheme="majorHAnsi" w:cstheme="majorHAnsi"/>
@@ -316,7 +165,133 @@
           <w:sz w:val="22"/>
           <w:szCs w:val="22"/>
         </w:rPr>
-        <w:t>Segment 3 – Solution</w:t>
+        <w:t xml:space="preserve"> - Problem</w:t>
+      </w:r>
+    </w:p>
+    <w:p>
+      <w:pPr>
+        <w:pStyle w:val="NormalWeb"/>
+        <w:spacing w:before="0" w:beforeAutospacing="0" w:after="0" w:afterAutospacing="0"/>
+        <w:rPr>
+          <w:rFonts w:asciiTheme="majorHAnsi" w:hAnsiTheme="majorHAnsi" w:cstheme="majorHAnsi"/>
+        </w:rPr>
+      </w:pPr>
+      <w:r>
+        <w:rPr>
+          <w:rFonts w:asciiTheme="majorHAnsi" w:hAnsiTheme="majorHAnsi" w:cstheme="majorHAnsi"/>
+          <w:color w:val="000000"/>
+          <w:sz w:val="22"/>
+          <w:szCs w:val="22"/>
+        </w:rPr>
+        <w:t> </w:t>
+      </w:r>
+    </w:p>
+    <w:p>
+      <w:pPr>
+        <w:pStyle w:val="NormalWeb"/>
+        <w:spacing w:before="0" w:beforeAutospacing="0" w:after="0" w:afterAutospacing="0"/>
+        <w:rPr>
+          <w:rFonts w:asciiTheme="majorHAnsi" w:hAnsiTheme="majorHAnsi" w:cstheme="majorHAnsi"/>
+        </w:rPr>
+      </w:pPr>
+      <w:r>
+        <w:rPr>
+          <w:rFonts w:asciiTheme="majorHAnsi" w:hAnsiTheme="majorHAnsi" w:cstheme="majorHAnsi"/>
+          <w:color w:val="000000"/>
+          <w:sz w:val="22"/>
+          <w:szCs w:val="22"/>
+        </w:rPr>
+        <w:t xml:space="preserve">Teams can see live telemetry, but the strategic questions have changed: Engineers </w:t>
+      </w:r>
+      <w:r>
+        <w:rPr>
+          <w:rFonts w:asciiTheme="majorHAnsi" w:hAnsiTheme="majorHAnsi" w:cstheme="majorHAnsi"/>
+          <w:color w:val="000000"/>
+          <w:sz w:val="22"/>
+          <w:szCs w:val="22"/>
+        </w:rPr>
+        <w:t>must</w:t>
+      </w:r>
+      <w:r>
+        <w:rPr>
+          <w:rFonts w:asciiTheme="majorHAnsi" w:hAnsiTheme="majorHAnsi" w:cstheme="majorHAnsi"/>
+          <w:color w:val="000000"/>
+          <w:sz w:val="22"/>
+          <w:szCs w:val="22"/>
+        </w:rPr>
+        <w:t xml:space="preserve"> decide where to harvest, when to deploy overtake and how to dynamically conserve energy lap by lap.</w:t>
+      </w:r>
+    </w:p>
+    <w:p>
+      <w:pPr>
+        <w:pStyle w:val="NormalWeb"/>
+        <w:spacing w:before="0" w:beforeAutospacing="0" w:after="0" w:afterAutospacing="0"/>
+        <w:rPr>
+          <w:rFonts w:asciiTheme="majorHAnsi" w:hAnsiTheme="majorHAnsi" w:cstheme="majorHAnsi"/>
+        </w:rPr>
+      </w:pPr>
+      <w:r>
+        <w:rPr>
+          <w:rFonts w:asciiTheme="majorHAnsi" w:hAnsiTheme="majorHAnsi" w:cstheme="majorHAnsi"/>
+          <w:color w:val="000000"/>
+          <w:sz w:val="22"/>
+          <w:szCs w:val="22"/>
+        </w:rPr>
+        <w:t> </w:t>
+      </w:r>
+    </w:p>
+    <w:p>
+      <w:pPr>
+        <w:pStyle w:val="NormalWeb"/>
+        <w:spacing w:before="0" w:beforeAutospacing="0" w:after="0" w:afterAutospacing="0"/>
+        <w:rPr>
+          <w:rFonts w:asciiTheme="majorHAnsi" w:hAnsiTheme="majorHAnsi" w:cstheme="majorHAnsi"/>
+        </w:rPr>
+      </w:pPr>
+      <w:r>
+        <w:rPr>
+          <w:rFonts w:asciiTheme="majorHAnsi" w:hAnsiTheme="majorHAnsi" w:cstheme="majorHAnsi"/>
+          <w:color w:val="000000"/>
+          <w:sz w:val="22"/>
+          <w:szCs w:val="22"/>
+        </w:rPr>
+        <w:t>Even broadcaster and fans can not longer easily follow what is happening on the track, because what used to look like “they are just driving fast” now hides an entire chess match in energy management strategy.</w:t>
+      </w:r>
+    </w:p>
+    <w:p>
+      <w:pPr>
+        <w:pStyle w:val="NormalWeb"/>
+        <w:spacing w:before="0" w:beforeAutospacing="0" w:after="0" w:afterAutospacing="0"/>
+        <w:rPr>
+          <w:rFonts w:asciiTheme="majorHAnsi" w:hAnsiTheme="majorHAnsi" w:cstheme="majorHAnsi"/>
+        </w:rPr>
+      </w:pPr>
+      <w:r>
+        <w:rPr>
+          <w:rFonts w:asciiTheme="majorHAnsi" w:hAnsiTheme="majorHAnsi" w:cstheme="majorHAnsi"/>
+          <w:color w:val="000000"/>
+          <w:sz w:val="22"/>
+          <w:szCs w:val="22"/>
+        </w:rPr>
+        <w:t> </w:t>
+      </w:r>
+    </w:p>
+    <w:p>
+      <w:pPr>
+        <w:pStyle w:val="NormalWeb"/>
+        <w:spacing w:before="0" w:beforeAutospacing="0" w:after="0" w:afterAutospacing="0"/>
+        <w:rPr>
+          <w:rFonts w:asciiTheme="majorHAnsi" w:hAnsiTheme="majorHAnsi" w:cstheme="majorHAnsi"/>
+        </w:rPr>
+      </w:pPr>
+      <w:r>
+        <w:rPr>
+          <w:rFonts w:asciiTheme="majorHAnsi" w:hAnsiTheme="majorHAnsi" w:cstheme="majorHAnsi"/>
+          <w:color w:val="000000"/>
+          <w:sz w:val="22"/>
+          <w:szCs w:val="22"/>
+        </w:rPr>
+        <w:t>There is a need for an explainable intelligence layer that translates these energy strategy reasoning into plain language, while grounding every insight of the race in the regulations that shape its decisions.</w:t>
       </w:r>
     </w:p>
     <w:p>
@@ -350,41 +325,14 @@
       <w:r>
         <w:rPr>
           <w:rFonts w:asciiTheme="majorHAnsi" w:hAnsiTheme="majorHAnsi" w:cstheme="majorHAnsi"/>
-          <w:color w:val="000000"/>
-          <w:sz w:val="22"/>
-          <w:szCs w:val="22"/>
-        </w:rPr>
-        <w:t>OVERRIDE is an explainable AI race-strategy copilot that helps teams and fans understand 2026 hybrid energy decisions through telemetry reasoning, regulation grounding and what-if analysis.</w:t>
-      </w:r>
-    </w:p>
-    <w:p>
-      <w:pPr>
-        <w:pStyle w:val="NormalWeb"/>
-        <w:spacing w:before="0" w:beforeAutospacing="0" w:after="0" w:afterAutospacing="0"/>
-        <w:rPr>
-          <w:rFonts w:asciiTheme="majorHAnsi" w:hAnsiTheme="majorHAnsi" w:cstheme="majorHAnsi"/>
-        </w:rPr>
-      </w:pPr>
-      <w:r>
-        <w:rPr>
-          <w:rFonts w:asciiTheme="majorHAnsi" w:hAnsiTheme="majorHAnsi" w:cstheme="majorHAnsi"/>
           <w:b/>
           <w:bCs/>
           <w:color w:val="000000"/>
           <w:sz w:val="22"/>
           <w:szCs w:val="22"/>
         </w:rPr>
-        <w:t> </w:t>
-      </w:r>
-    </w:p>
-    <w:p>
-      <w:pPr>
-        <w:pStyle w:val="NormalWeb"/>
-        <w:spacing w:before="0" w:beforeAutospacing="0" w:after="0" w:afterAutospacing="0"/>
-        <w:rPr>
-          <w:rFonts w:asciiTheme="majorHAnsi" w:hAnsiTheme="majorHAnsi" w:cstheme="majorHAnsi"/>
-        </w:rPr>
-      </w:pPr>
+        <w:t xml:space="preserve">Segment </w:t>
+      </w:r>
       <w:r>
         <w:rPr>
           <w:rFonts w:asciiTheme="majorHAnsi" w:hAnsiTheme="majorHAnsi" w:cstheme="majorHAnsi"/>
@@ -394,71 +342,8 @@
           <w:sz w:val="22"/>
           <w:szCs w:val="22"/>
         </w:rPr>
-        <w:t>Segment 3 - Live Cockpit</w:t>
-      </w:r>
-    </w:p>
-    <w:p>
-      <w:pPr>
-        <w:pStyle w:val="NormalWeb"/>
-        <w:spacing w:before="0" w:beforeAutospacing="0" w:after="0" w:afterAutospacing="0"/>
-        <w:rPr>
-          <w:rFonts w:asciiTheme="majorHAnsi" w:hAnsiTheme="majorHAnsi" w:cstheme="majorHAnsi"/>
-        </w:rPr>
-      </w:pPr>
-      <w:r>
-        <w:rPr>
-          <w:rFonts w:asciiTheme="majorHAnsi" w:hAnsiTheme="majorHAnsi" w:cstheme="majorHAnsi"/>
-          <w:color w:val="000000"/>
-          <w:sz w:val="22"/>
-          <w:szCs w:val="22"/>
-        </w:rPr>
-        <w:t> </w:t>
-      </w:r>
-    </w:p>
-    <w:p>
-      <w:pPr>
-        <w:pStyle w:val="NormalWeb"/>
-        <w:spacing w:before="0" w:beforeAutospacing="0" w:after="0" w:afterAutospacing="0"/>
-        <w:rPr>
-          <w:rFonts w:asciiTheme="majorHAnsi" w:hAnsiTheme="majorHAnsi" w:cstheme="majorHAnsi"/>
-        </w:rPr>
-      </w:pPr>
-      <w:r>
-        <w:rPr>
-          <w:rFonts w:asciiTheme="majorHAnsi" w:hAnsiTheme="majorHAnsi" w:cstheme="majorHAnsi"/>
-          <w:color w:val="000000"/>
-          <w:sz w:val="22"/>
-          <w:szCs w:val="22"/>
-        </w:rPr>
-        <w:t>OVERRIDE simulates the IBM TORCS learning lab into a live racing cockpit. During the race it streams lap telemetry, tracks state of charge, harvest, deploy, and race timing, then highlights deterministic energy pressure while Granite prepares a readable race-engineer explanation.</w:t>
-      </w:r>
-    </w:p>
-    <w:p>
-      <w:pPr>
-        <w:pStyle w:val="NormalWeb"/>
-        <w:spacing w:before="0" w:beforeAutospacing="0" w:after="0" w:afterAutospacing="0"/>
-        <w:rPr>
-          <w:rFonts w:asciiTheme="majorHAnsi" w:hAnsiTheme="majorHAnsi" w:cstheme="majorHAnsi"/>
-        </w:rPr>
-      </w:pPr>
-      <w:r>
-        <w:rPr>
-          <w:rFonts w:asciiTheme="majorHAnsi" w:hAnsiTheme="majorHAnsi" w:cstheme="majorHAnsi"/>
-          <w:color w:val="000000"/>
-          <w:sz w:val="22"/>
-          <w:szCs w:val="22"/>
-        </w:rPr>
-        <w:t> </w:t>
-      </w:r>
-    </w:p>
-    <w:p>
-      <w:pPr>
-        <w:pStyle w:val="NormalWeb"/>
-        <w:spacing w:before="0" w:beforeAutospacing="0" w:after="0" w:afterAutospacing="0"/>
-        <w:rPr>
-          <w:rFonts w:asciiTheme="majorHAnsi" w:hAnsiTheme="majorHAnsi" w:cstheme="majorHAnsi"/>
-        </w:rPr>
-      </w:pPr>
+        <w:t>2.2</w:t>
+      </w:r>
       <w:r>
         <w:rPr>
           <w:rFonts w:asciiTheme="majorHAnsi" w:hAnsiTheme="majorHAnsi" w:cstheme="majorHAnsi"/>
@@ -468,214 +353,7 @@
           <w:sz w:val="22"/>
           <w:szCs w:val="22"/>
         </w:rPr>
-        <w:t>Segment 4 - Debrief</w:t>
-      </w:r>
-    </w:p>
-    <w:p>
-      <w:pPr>
-        <w:pStyle w:val="NormalWeb"/>
-        <w:spacing w:before="0" w:beforeAutospacing="0" w:after="0" w:afterAutospacing="0"/>
-        <w:rPr>
-          <w:rFonts w:asciiTheme="majorHAnsi" w:hAnsiTheme="majorHAnsi" w:cstheme="majorHAnsi"/>
-        </w:rPr>
-      </w:pPr>
-      <w:r>
-        <w:rPr>
-          <w:rFonts w:asciiTheme="majorHAnsi" w:hAnsiTheme="majorHAnsi" w:cstheme="majorHAnsi"/>
-          <w:color w:val="000000"/>
-          <w:sz w:val="22"/>
-          <w:szCs w:val="22"/>
-        </w:rPr>
-        <w:t> </w:t>
-      </w:r>
-    </w:p>
-    <w:p>
-      <w:pPr>
-        <w:pStyle w:val="NormalWeb"/>
-        <w:spacing w:before="0" w:beforeAutospacing="0" w:after="0" w:afterAutospacing="0"/>
-        <w:rPr>
-          <w:rFonts w:asciiTheme="majorHAnsi" w:hAnsiTheme="majorHAnsi" w:cstheme="majorHAnsi"/>
-          <w:color w:val="000000"/>
-          <w:sz w:val="22"/>
-          <w:szCs w:val="22"/>
-        </w:rPr>
-      </w:pPr>
-      <w:r>
-        <w:rPr>
-          <w:rFonts w:asciiTheme="majorHAnsi" w:hAnsiTheme="majorHAnsi" w:cstheme="majorHAnsi"/>
-          <w:color w:val="000000"/>
-          <w:sz w:val="22"/>
-          <w:szCs w:val="22"/>
-        </w:rPr>
-        <w:t xml:space="preserve">After the run, one click turns the capture into a full race session debrief. </w:t>
-      </w:r>
-      <w:r>
-        <w:rPr>
-          <w:rFonts w:asciiTheme="majorHAnsi" w:hAnsiTheme="majorHAnsi" w:cstheme="majorHAnsi"/>
-          <w:color w:val="000000"/>
-          <w:sz w:val="22"/>
-          <w:szCs w:val="22"/>
-        </w:rPr>
-        <w:t>You can also Upload a replay</w:t>
-      </w:r>
-      <w:r>
-        <w:rPr>
-          <w:rFonts w:asciiTheme="majorHAnsi" w:hAnsiTheme="majorHAnsi" w:cstheme="majorHAnsi"/>
-          <w:color w:val="000000"/>
-          <w:sz w:val="22"/>
-          <w:szCs w:val="22"/>
-        </w:rPr>
-        <w:t xml:space="preserve"> FastF1</w:t>
-      </w:r>
-      <w:r>
-        <w:rPr>
-          <w:rFonts w:asciiTheme="majorHAnsi" w:hAnsiTheme="majorHAnsi" w:cstheme="majorHAnsi"/>
-          <w:color w:val="000000"/>
-          <w:sz w:val="22"/>
-          <w:szCs w:val="22"/>
-        </w:rPr>
-        <w:t xml:space="preserve">. </w:t>
-      </w:r>
-      <w:r>
-        <w:rPr>
-          <w:rFonts w:asciiTheme="majorHAnsi" w:hAnsiTheme="majorHAnsi" w:cstheme="majorHAnsi"/>
-          <w:color w:val="000000"/>
-          <w:sz w:val="22"/>
-          <w:szCs w:val="22"/>
-        </w:rPr>
-        <w:t>OVERRIDE</w:t>
-      </w:r>
-      <w:r>
-        <w:rPr>
-          <w:rFonts w:asciiTheme="majorHAnsi" w:hAnsiTheme="majorHAnsi" w:cstheme="majorHAnsi"/>
-          <w:color w:val="000000"/>
-          <w:sz w:val="22"/>
-          <w:szCs w:val="22"/>
-        </w:rPr>
-        <w:t xml:space="preserve"> </w:t>
-      </w:r>
-      <w:r>
-        <w:rPr>
-          <w:rFonts w:asciiTheme="majorHAnsi" w:hAnsiTheme="majorHAnsi" w:cstheme="majorHAnsi"/>
-          <w:color w:val="000000"/>
-          <w:sz w:val="22"/>
-          <w:szCs w:val="22"/>
-        </w:rPr>
-        <w:t>analys</w:t>
-      </w:r>
-      <w:r>
-        <w:rPr>
-          <w:rFonts w:asciiTheme="majorHAnsi" w:hAnsiTheme="majorHAnsi" w:cstheme="majorHAnsi"/>
-          <w:color w:val="000000"/>
-          <w:sz w:val="22"/>
-          <w:szCs w:val="22"/>
-        </w:rPr>
-        <w:t>e the</w:t>
-      </w:r>
-      <w:r>
-        <w:rPr>
-          <w:rFonts w:asciiTheme="majorHAnsi" w:hAnsiTheme="majorHAnsi" w:cstheme="majorHAnsi"/>
-          <w:color w:val="000000"/>
-          <w:sz w:val="22"/>
-          <w:szCs w:val="22"/>
-        </w:rPr>
-        <w:t xml:space="preserve"> session</w:t>
-      </w:r>
-      <w:r>
-        <w:rPr>
-          <w:rFonts w:asciiTheme="majorHAnsi" w:hAnsiTheme="majorHAnsi" w:cstheme="majorHAnsi"/>
-          <w:color w:val="000000"/>
-          <w:sz w:val="22"/>
-          <w:szCs w:val="22"/>
-        </w:rPr>
-        <w:t xml:space="preserve"> Lap by Lap,</w:t>
-      </w:r>
-      <w:r>
-        <w:rPr>
-          <w:rFonts w:asciiTheme="majorHAnsi" w:hAnsiTheme="majorHAnsi" w:cstheme="majorHAnsi"/>
-          <w:color w:val="000000"/>
-          <w:sz w:val="22"/>
-          <w:szCs w:val="22"/>
-        </w:rPr>
-        <w:t xml:space="preserve"> finds inefficient zones, grades battery risk, and surfaces the moments that mattered most during the </w:t>
-      </w:r>
-      <w:r>
-        <w:rPr>
-          <w:rFonts w:asciiTheme="majorHAnsi" w:hAnsiTheme="majorHAnsi" w:cstheme="majorHAnsi"/>
-          <w:color w:val="000000"/>
-          <w:sz w:val="22"/>
-          <w:szCs w:val="22"/>
-        </w:rPr>
-        <w:t>race</w:t>
-      </w:r>
-      <w:r>
-        <w:rPr>
-          <w:rFonts w:asciiTheme="majorHAnsi" w:hAnsiTheme="majorHAnsi" w:cstheme="majorHAnsi"/>
-          <w:color w:val="000000"/>
-          <w:sz w:val="22"/>
-          <w:szCs w:val="22"/>
-        </w:rPr>
-        <w:t>, not just a chart, but cause, consequence, recommendation, and evidence.</w:t>
-      </w:r>
-      <w:r>
-        <w:rPr>
-          <w:rFonts w:asciiTheme="majorHAnsi" w:hAnsiTheme="majorHAnsi" w:cstheme="majorHAnsi"/>
-          <w:color w:val="000000"/>
-          <w:sz w:val="22"/>
-          <w:szCs w:val="22"/>
-        </w:rPr>
-        <w:t xml:space="preserve">  </w:t>
-      </w:r>
-    </w:p>
-    <w:p>
-      <w:pPr>
-        <w:pStyle w:val="NormalWeb"/>
-        <w:spacing w:before="0" w:beforeAutospacing="0" w:after="0" w:afterAutospacing="0"/>
-        <w:rPr>
-          <w:rFonts w:asciiTheme="majorHAnsi" w:hAnsiTheme="majorHAnsi" w:cstheme="majorHAnsi"/>
-          <w:color w:val="000000"/>
-          <w:sz w:val="22"/>
-          <w:szCs w:val="22"/>
-        </w:rPr>
-      </w:pPr>
-    </w:p>
-    <w:p>
-      <w:pPr>
-        <w:pStyle w:val="NormalWeb"/>
-        <w:spacing w:before="0" w:beforeAutospacing="0" w:after="0" w:afterAutospacing="0"/>
-        <w:rPr>
-          <w:rFonts w:asciiTheme="majorHAnsi" w:hAnsiTheme="majorHAnsi" w:cstheme="majorHAnsi"/>
-        </w:rPr>
-      </w:pPr>
-      <w:r>
-        <w:rPr>
-          <w:rFonts w:asciiTheme="majorHAnsi" w:hAnsiTheme="majorHAnsi" w:cstheme="majorHAnsi"/>
-        </w:rPr>
-        <w:t>Click any zone Granite 4-h-small Instruct explains the cause, the consequence, and grounds its recommendation in the 2026 FIA technical regulations, parsed with Docling.</w:t>
-      </w:r>
-      <w:r>
-        <w:rPr>
-          <w:rFonts w:asciiTheme="majorHAnsi" w:hAnsiTheme="majorHAnsi" w:cstheme="majorHAnsi"/>
-        </w:rPr>
-        <w:t xml:space="preserve">  </w:t>
-      </w:r>
-    </w:p>
-    <w:p>
-      <w:pPr>
-        <w:pStyle w:val="NormalWeb"/>
-        <w:spacing w:before="0" w:beforeAutospacing="0" w:after="0" w:afterAutospacing="0"/>
-        <w:rPr>
-          <w:rFonts w:asciiTheme="majorHAnsi" w:hAnsiTheme="majorHAnsi" w:cstheme="majorHAnsi"/>
-        </w:rPr>
-      </w:pPr>
-      <w:r>
-        <w:rPr>
-          <w:rFonts w:asciiTheme="majorHAnsi" w:hAnsiTheme="majorHAnsi" w:cstheme="majorHAnsi"/>
-          <w:color w:val="000000"/>
-          <w:sz w:val="22"/>
-          <w:szCs w:val="22"/>
-        </w:rPr>
-        <w:t> </w:t>
+        <w:t xml:space="preserve"> – Solution</w:t>
       </w:r>
     </w:p>
     <w:p>
@@ -695,24 +373,6 @@
           <w:sz w:val="22"/>
           <w:szCs w:val="22"/>
         </w:rPr>
-        <w:t>Segment 5 - Explainability</w:t>
-      </w:r>
-    </w:p>
-    <w:p>
-      <w:pPr>
-        <w:pStyle w:val="NormalWeb"/>
-        <w:spacing w:before="0" w:beforeAutospacing="0" w:after="0" w:afterAutospacing="0"/>
-        <w:rPr>
-          <w:rFonts w:asciiTheme="majorHAnsi" w:hAnsiTheme="majorHAnsi" w:cstheme="majorHAnsi"/>
-        </w:rPr>
-      </w:pPr>
-      <w:r>
-        <w:rPr>
-          <w:rFonts w:asciiTheme="majorHAnsi" w:hAnsiTheme="majorHAnsi" w:cstheme="majorHAnsi"/>
-          <w:color w:val="000000"/>
-          <w:sz w:val="22"/>
-          <w:szCs w:val="22"/>
-        </w:rPr>
         <w:t> </w:t>
       </w:r>
     </w:p>
@@ -731,89 +391,7 @@
           <w:sz w:val="22"/>
           <w:szCs w:val="22"/>
         </w:rPr>
-        <w:lastRenderedPageBreak/>
-        <w:t>This is the trust layer. Every recommendation</w:t>
-      </w:r>
-      <w:r>
-        <w:rPr>
-          <w:rFonts w:asciiTheme="majorHAnsi" w:hAnsiTheme="majorHAnsi" w:cstheme="majorHAnsi"/>
-          <w:color w:val="000000"/>
-          <w:sz w:val="22"/>
-          <w:szCs w:val="22"/>
-        </w:rPr>
-        <w:t xml:space="preserve"> cites a verbatim clause</w:t>
-      </w:r>
-      <w:r>
-        <w:rPr>
-          <w:rFonts w:asciiTheme="majorHAnsi" w:hAnsiTheme="majorHAnsi" w:cstheme="majorHAnsi"/>
-          <w:color w:val="000000"/>
-          <w:sz w:val="22"/>
-          <w:szCs w:val="22"/>
-        </w:rPr>
-        <w:t xml:space="preserve"> grounded</w:t>
-      </w:r>
-      <w:r>
-        <w:rPr>
-          <w:rFonts w:asciiTheme="majorHAnsi" w:hAnsiTheme="majorHAnsi" w:cstheme="majorHAnsi"/>
-          <w:color w:val="000000"/>
-          <w:sz w:val="22"/>
-          <w:szCs w:val="22"/>
-        </w:rPr>
-        <w:t xml:space="preserve"> in a Docling-parsed </w:t>
-      </w:r>
-      <w:r>
-        <w:rPr>
-          <w:rFonts w:asciiTheme="majorHAnsi" w:hAnsiTheme="majorHAnsi" w:cstheme="majorHAnsi"/>
-          <w:color w:val="000000"/>
-          <w:sz w:val="22"/>
-          <w:szCs w:val="22"/>
-        </w:rPr>
-        <w:t xml:space="preserve">official </w:t>
-      </w:r>
-      <w:r>
-        <w:rPr>
-          <w:rFonts w:asciiTheme="majorHAnsi" w:hAnsiTheme="majorHAnsi" w:cstheme="majorHAnsi"/>
-          <w:color w:val="000000"/>
-          <w:sz w:val="22"/>
-          <w:szCs w:val="22"/>
-        </w:rPr>
-        <w:t>FI</w:t>
-      </w:r>
-      <w:r>
-        <w:rPr>
-          <w:rFonts w:asciiTheme="majorHAnsi" w:hAnsiTheme="majorHAnsi" w:cstheme="majorHAnsi"/>
-          <w:color w:val="000000"/>
-          <w:sz w:val="22"/>
-          <w:szCs w:val="22"/>
-        </w:rPr>
-        <w:t>A</w:t>
-      </w:r>
-      <w:r>
-        <w:rPr>
-          <w:rFonts w:asciiTheme="majorHAnsi" w:hAnsiTheme="majorHAnsi" w:cstheme="majorHAnsi"/>
-          <w:color w:val="000000"/>
-          <w:sz w:val="22"/>
-          <w:szCs w:val="22"/>
-        </w:rPr>
-        <w:t xml:space="preserve"> regulation passage. Pass one is deterministic validation. Pass two is Granite Guardian with custom safety criteria. If the system catches a malformed answer, it shows there was a failure instead of hiding it.</w:t>
-      </w:r>
-    </w:p>
-    <w:p>
-      <w:pPr>
-        <w:pStyle w:val="NormalWeb"/>
-        <w:spacing w:before="0" w:beforeAutospacing="0" w:after="0" w:afterAutospacing="0"/>
-        <w:rPr>
-          <w:rFonts w:asciiTheme="majorHAnsi" w:hAnsiTheme="majorHAnsi" w:cstheme="majorHAnsi"/>
-        </w:rPr>
-      </w:pPr>
-      <w:r>
-        <w:rPr>
-          <w:rFonts w:asciiTheme="majorHAnsi" w:hAnsiTheme="majorHAnsi" w:cstheme="majorHAnsi"/>
-          <w:color w:val="000000"/>
-          <w:sz w:val="22"/>
-          <w:szCs w:val="22"/>
-        </w:rPr>
-        <w:t> </w:t>
+        <w:t>OVERRIDE is an explainable AI race-strategy copilot that helps teams and fans understand 2026 hybrid energy decisions through telemetry reasoning, regulation grounding and what-if analysis.</w:t>
       </w:r>
     </w:p>
     <w:p>
@@ -833,24 +411,6 @@
           <w:sz w:val="22"/>
           <w:szCs w:val="22"/>
         </w:rPr>
-        <w:t>Segment 6 - What-If and Fan Mode</w:t>
-      </w:r>
-    </w:p>
-    <w:p>
-      <w:pPr>
-        <w:pStyle w:val="NormalWeb"/>
-        <w:spacing w:before="0" w:beforeAutospacing="0" w:after="0" w:afterAutospacing="0"/>
-        <w:rPr>
-          <w:rFonts w:asciiTheme="majorHAnsi" w:hAnsiTheme="majorHAnsi" w:cstheme="majorHAnsi"/>
-        </w:rPr>
-      </w:pPr>
-      <w:r>
-        <w:rPr>
-          <w:rFonts w:asciiTheme="majorHAnsi" w:hAnsiTheme="majorHAnsi" w:cstheme="majorHAnsi"/>
-          <w:color w:val="000000"/>
-          <w:sz w:val="22"/>
-          <w:szCs w:val="22"/>
-        </w:rPr>
         <w:t> </w:t>
       </w:r>
     </w:p>
@@ -860,66 +420,7 @@
         <w:spacing w:before="0" w:beforeAutospacing="0" w:after="0" w:afterAutospacing="0"/>
         <w:rPr>
           <w:rFonts w:asciiTheme="majorHAnsi" w:hAnsiTheme="majorHAnsi" w:cstheme="majorHAnsi"/>
-          <w:color w:val="000000"/>
-          <w:sz w:val="22"/>
-          <w:szCs w:val="22"/>
-        </w:rPr>
-      </w:pPr>
-      <w:r>
-        <w:rPr>
-          <w:rFonts w:asciiTheme="majorHAnsi" w:hAnsiTheme="majorHAnsi" w:cstheme="majorHAnsi"/>
-          <w:color w:val="000000"/>
-          <w:sz w:val="22"/>
-          <w:szCs w:val="22"/>
-        </w:rPr>
-        <w:t>Furthermore, Engineers can test a counterfactual and see the same pipeline rerun on alternate strategies. The Fan Mode feature of the application translates the same technical evidence into plain language, so teams, drivers, broadcasters, and fans can share the same explanation.</w:t>
-      </w:r>
-    </w:p>
-    <w:p>
-      <w:pPr>
-        <w:pStyle w:val="NormalWeb"/>
-        <w:spacing w:before="0" w:beforeAutospacing="0" w:after="0" w:afterAutospacing="0"/>
-        <w:rPr>
-          <w:rFonts w:asciiTheme="majorHAnsi" w:hAnsiTheme="majorHAnsi" w:cstheme="majorHAnsi"/>
-          <w:color w:val="000000"/>
-          <w:sz w:val="22"/>
-          <w:szCs w:val="22"/>
-        </w:rPr>
-      </w:pPr>
-    </w:p>
-    <w:p>
-      <w:pPr>
-        <w:pStyle w:val="NormalWeb"/>
-        <w:spacing w:before="0" w:beforeAutospacing="0" w:after="0" w:afterAutospacing="0"/>
-        <w:rPr>
-          <w:rFonts w:asciiTheme="majorHAnsi" w:hAnsiTheme="majorHAnsi" w:cstheme="majorHAnsi"/>
-        </w:rPr>
-      </w:pPr>
-    </w:p>
-    <w:p>
-      <w:pPr>
-        <w:pStyle w:val="NormalWeb"/>
-        <w:spacing w:before="0" w:beforeAutospacing="0" w:after="0" w:afterAutospacing="0"/>
-        <w:rPr>
-          <w:rFonts w:asciiTheme="majorHAnsi" w:hAnsiTheme="majorHAnsi" w:cstheme="majorHAnsi"/>
-        </w:rPr>
-      </w:pPr>
-      <w:r>
-        <w:rPr>
-          <w:rFonts w:asciiTheme="majorHAnsi" w:hAnsiTheme="majorHAnsi" w:cstheme="majorHAnsi"/>
-          <w:color w:val="000000"/>
-          <w:sz w:val="22"/>
-          <w:szCs w:val="22"/>
-        </w:rPr>
-        <w:t> </w:t>
-      </w:r>
-    </w:p>
-    <w:p>
-      <w:pPr>
-        <w:pStyle w:val="NormalWeb"/>
-        <w:spacing w:before="0" w:beforeAutospacing="0" w:after="0" w:afterAutospacing="0"/>
-        <w:rPr>
-          <w:rFonts w:asciiTheme="majorHAnsi" w:hAnsiTheme="majorHAnsi" w:cstheme="majorHAnsi"/>
+          <w:highlight w:val="yellow"/>
         </w:rPr>
       </w:pPr>
       <w:r>
@@ -930,6 +431,631 @@
           <w:color w:val="000000"/>
           <w:sz w:val="22"/>
           <w:szCs w:val="22"/>
+          <w:highlight w:val="yellow"/>
+        </w:rPr>
+        <w:t>Segment 3 - Live Cockpit</w:t>
+      </w:r>
+    </w:p>
+    <w:p>
+      <w:pPr>
+        <w:pStyle w:val="NormalWeb"/>
+        <w:spacing w:before="0" w:beforeAutospacing="0" w:after="0" w:afterAutospacing="0"/>
+        <w:rPr>
+          <w:rFonts w:asciiTheme="majorHAnsi" w:hAnsiTheme="majorHAnsi" w:cstheme="majorHAnsi"/>
+          <w:highlight w:val="yellow"/>
+        </w:rPr>
+      </w:pPr>
+      <w:r>
+        <w:rPr>
+          <w:rFonts w:asciiTheme="majorHAnsi" w:hAnsiTheme="majorHAnsi" w:cstheme="majorHAnsi"/>
+          <w:color w:val="000000"/>
+          <w:sz w:val="22"/>
+          <w:szCs w:val="22"/>
+          <w:highlight w:val="yellow"/>
+        </w:rPr>
+        <w:t> </w:t>
+      </w:r>
+    </w:p>
+    <w:p>
+      <w:pPr>
+        <w:pStyle w:val="NormalWeb"/>
+        <w:spacing w:before="0" w:beforeAutospacing="0" w:after="0" w:afterAutospacing="0"/>
+        <w:rPr>
+          <w:rFonts w:asciiTheme="majorHAnsi" w:hAnsiTheme="majorHAnsi" w:cstheme="majorHAnsi"/>
+          <w:color w:val="000000"/>
+          <w:sz w:val="22"/>
+          <w:szCs w:val="22"/>
+          <w:highlight w:val="yellow"/>
+        </w:rPr>
+      </w:pPr>
+      <w:r>
+        <w:rPr>
+          <w:rFonts w:asciiTheme="majorHAnsi" w:hAnsiTheme="majorHAnsi" w:cstheme="majorHAnsi"/>
+          <w:color w:val="000000"/>
+          <w:sz w:val="22"/>
+          <w:szCs w:val="22"/>
+          <w:highlight w:val="yellow"/>
+        </w:rPr>
+        <w:t xml:space="preserve">OVERRIDE simulates the IBM TORCS learning lab into a live racing cockpit. </w:t>
+      </w:r>
+    </w:p>
+    <w:p>
+      <w:pPr>
+        <w:pStyle w:val="NormalWeb"/>
+        <w:spacing w:before="0" w:beforeAutospacing="0" w:after="0" w:afterAutospacing="0"/>
+        <w:rPr>
+          <w:rFonts w:asciiTheme="majorHAnsi" w:hAnsiTheme="majorHAnsi" w:cstheme="majorHAnsi"/>
+          <w:color w:val="000000"/>
+          <w:sz w:val="22"/>
+          <w:szCs w:val="22"/>
+          <w:highlight w:val="yellow"/>
+        </w:rPr>
+      </w:pPr>
+    </w:p>
+    <w:p>
+      <w:pPr>
+        <w:pStyle w:val="NormalWeb"/>
+        <w:spacing w:before="0" w:beforeAutospacing="0" w:after="0" w:afterAutospacing="0"/>
+        <w:rPr>
+          <w:rFonts w:asciiTheme="majorHAnsi" w:hAnsiTheme="majorHAnsi" w:cstheme="majorHAnsi"/>
+        </w:rPr>
+      </w:pPr>
+      <w:r>
+        <w:rPr>
+          <w:rFonts w:asciiTheme="majorHAnsi" w:hAnsiTheme="majorHAnsi" w:cstheme="majorHAnsi"/>
+          <w:color w:val="000000"/>
+          <w:sz w:val="22"/>
+          <w:szCs w:val="22"/>
+          <w:highlight w:val="yellow"/>
+        </w:rPr>
+        <w:t>During the race it streams lap telemetry, tracks state of charge, harvest, deploy, and race timing, then highlights deterministic energy pressure while Granite prepares a readable race-engineer explanation.</w:t>
+      </w:r>
+    </w:p>
+    <w:p>
+      <w:pPr>
+        <w:pStyle w:val="NormalWeb"/>
+        <w:spacing w:before="0" w:beforeAutospacing="0" w:after="0" w:afterAutospacing="0"/>
+        <w:rPr>
+          <w:rFonts w:asciiTheme="majorHAnsi" w:hAnsiTheme="majorHAnsi" w:cstheme="majorHAnsi"/>
+        </w:rPr>
+      </w:pPr>
+      <w:r>
+        <w:rPr>
+          <w:rFonts w:asciiTheme="majorHAnsi" w:hAnsiTheme="majorHAnsi" w:cstheme="majorHAnsi"/>
+          <w:color w:val="000000"/>
+          <w:sz w:val="22"/>
+          <w:szCs w:val="22"/>
+        </w:rPr>
+        <w:t> </w:t>
+      </w:r>
+    </w:p>
+    <w:p>
+      <w:pPr>
+        <w:pStyle w:val="NormalWeb"/>
+        <w:spacing w:before="0" w:beforeAutospacing="0" w:after="0" w:afterAutospacing="0"/>
+        <w:rPr>
+          <w:rFonts w:asciiTheme="majorHAnsi" w:hAnsiTheme="majorHAnsi" w:cstheme="majorHAnsi"/>
+        </w:rPr>
+      </w:pPr>
+      <w:r>
+        <w:rPr>
+          <w:rFonts w:asciiTheme="majorHAnsi" w:hAnsiTheme="majorHAnsi" w:cstheme="majorHAnsi"/>
+          <w:b/>
+          <w:bCs/>
+          <w:color w:val="000000"/>
+          <w:sz w:val="22"/>
+          <w:szCs w:val="22"/>
+        </w:rPr>
+        <w:t>Segment 4 - Debrief</w:t>
+      </w:r>
+    </w:p>
+    <w:p>
+      <w:pPr>
+        <w:pStyle w:val="NormalWeb"/>
+        <w:spacing w:before="0" w:beforeAutospacing="0" w:after="0" w:afterAutospacing="0"/>
+        <w:rPr>
+          <w:rFonts w:asciiTheme="majorHAnsi" w:hAnsiTheme="majorHAnsi" w:cstheme="majorHAnsi"/>
+        </w:rPr>
+      </w:pPr>
+      <w:r>
+        <w:rPr>
+          <w:rFonts w:asciiTheme="majorHAnsi" w:hAnsiTheme="majorHAnsi" w:cstheme="majorHAnsi"/>
+          <w:color w:val="000000"/>
+          <w:sz w:val="22"/>
+          <w:szCs w:val="22"/>
+        </w:rPr>
+        <w:t> </w:t>
+      </w:r>
+    </w:p>
+    <w:p>
+      <w:pPr>
+        <w:pStyle w:val="NormalWeb"/>
+        <w:spacing w:before="0" w:beforeAutospacing="0" w:after="0" w:afterAutospacing="0"/>
+        <w:rPr>
+          <w:rFonts w:asciiTheme="majorHAnsi" w:hAnsiTheme="majorHAnsi" w:cstheme="majorHAnsi"/>
+          <w:color w:val="000000"/>
+          <w:sz w:val="22"/>
+          <w:szCs w:val="22"/>
+        </w:rPr>
+      </w:pPr>
+      <w:r>
+        <w:rPr>
+          <w:rFonts w:asciiTheme="majorHAnsi" w:hAnsiTheme="majorHAnsi" w:cstheme="majorHAnsi"/>
+          <w:color w:val="000000"/>
+          <w:sz w:val="22"/>
+          <w:szCs w:val="22"/>
+        </w:rPr>
+        <w:t xml:space="preserve">After the run, one click turns the capture into a full race session debrief. </w:t>
+      </w:r>
+      <w:r>
+        <w:rPr>
+          <w:rFonts w:asciiTheme="majorHAnsi" w:hAnsiTheme="majorHAnsi" w:cstheme="majorHAnsi"/>
+          <w:color w:val="000000"/>
+          <w:sz w:val="22"/>
+          <w:szCs w:val="22"/>
+        </w:rPr>
+        <w:t>You</w:t>
+      </w:r>
+      <w:r>
+        <w:rPr>
+          <w:rFonts w:asciiTheme="majorHAnsi" w:hAnsiTheme="majorHAnsi" w:cstheme="majorHAnsi"/>
+          <w:color w:val="000000"/>
+          <w:sz w:val="22"/>
+          <w:szCs w:val="22"/>
+        </w:rPr>
+        <w:t xml:space="preserve"> can</w:t>
+      </w:r>
+      <w:r>
+        <w:rPr>
+          <w:rFonts w:asciiTheme="majorHAnsi" w:hAnsiTheme="majorHAnsi" w:cstheme="majorHAnsi"/>
+          <w:color w:val="000000"/>
+          <w:sz w:val="22"/>
+          <w:szCs w:val="22"/>
+        </w:rPr>
+        <w:t xml:space="preserve"> also Upload a </w:t>
+      </w:r>
+      <w:r>
+        <w:rPr>
+          <w:rFonts w:asciiTheme="majorHAnsi" w:hAnsiTheme="majorHAnsi" w:cstheme="majorHAnsi"/>
+          <w:color w:val="000000"/>
+          <w:sz w:val="22"/>
+          <w:szCs w:val="22"/>
+        </w:rPr>
+        <w:t xml:space="preserve">Fast1 </w:t>
+      </w:r>
+      <w:r>
+        <w:rPr>
+          <w:rFonts w:asciiTheme="majorHAnsi" w:hAnsiTheme="majorHAnsi" w:cstheme="majorHAnsi"/>
+          <w:color w:val="000000"/>
+          <w:sz w:val="22"/>
+          <w:szCs w:val="22"/>
+        </w:rPr>
+        <w:t>replay</w:t>
+      </w:r>
+      <w:r>
+        <w:rPr>
+          <w:rFonts w:asciiTheme="majorHAnsi" w:hAnsiTheme="majorHAnsi" w:cstheme="majorHAnsi"/>
+          <w:color w:val="000000"/>
+          <w:sz w:val="22"/>
+          <w:szCs w:val="22"/>
+        </w:rPr>
+        <w:t xml:space="preserve"> </w:t>
+      </w:r>
+      <w:r>
+        <w:rPr>
+          <w:rFonts w:asciiTheme="majorHAnsi" w:hAnsiTheme="majorHAnsi" w:cstheme="majorHAnsi"/>
+          <w:color w:val="000000"/>
+          <w:sz w:val="22"/>
+          <w:szCs w:val="22"/>
+        </w:rPr>
+        <w:t>export</w:t>
+      </w:r>
+      <w:r>
+        <w:rPr>
+          <w:rFonts w:asciiTheme="majorHAnsi" w:hAnsiTheme="majorHAnsi" w:cstheme="majorHAnsi"/>
+          <w:color w:val="000000"/>
+          <w:sz w:val="22"/>
+          <w:szCs w:val="22"/>
+        </w:rPr>
+        <w:t xml:space="preserve">. </w:t>
+      </w:r>
+    </w:p>
+    <w:p>
+      <w:pPr>
+        <w:pStyle w:val="NormalWeb"/>
+        <w:spacing w:before="0" w:beforeAutospacing="0" w:after="0" w:afterAutospacing="0"/>
+        <w:rPr>
+          <w:rFonts w:asciiTheme="majorHAnsi" w:hAnsiTheme="majorHAnsi" w:cstheme="majorHAnsi"/>
+          <w:color w:val="000000"/>
+          <w:sz w:val="22"/>
+          <w:szCs w:val="22"/>
+        </w:rPr>
+      </w:pPr>
+    </w:p>
+    <w:p>
+      <w:pPr>
+        <w:pStyle w:val="NormalWeb"/>
+        <w:spacing w:before="0" w:beforeAutospacing="0" w:after="0" w:afterAutospacing="0"/>
+        <w:rPr>
+          <w:rFonts w:asciiTheme="majorHAnsi" w:hAnsiTheme="majorHAnsi" w:cstheme="majorHAnsi"/>
+          <w:color w:val="000000"/>
+          <w:sz w:val="22"/>
+          <w:szCs w:val="22"/>
+        </w:rPr>
+      </w:pPr>
+      <w:r>
+        <w:rPr>
+          <w:rFonts w:asciiTheme="majorHAnsi" w:hAnsiTheme="majorHAnsi" w:cstheme="majorHAnsi"/>
+          <w:color w:val="000000"/>
+          <w:sz w:val="22"/>
+          <w:szCs w:val="22"/>
+        </w:rPr>
+        <w:t>OVERRIDE</w:t>
+      </w:r>
+      <w:r>
+        <w:rPr>
+          <w:rFonts w:asciiTheme="majorHAnsi" w:hAnsiTheme="majorHAnsi" w:cstheme="majorHAnsi"/>
+          <w:color w:val="000000"/>
+          <w:sz w:val="22"/>
+          <w:szCs w:val="22"/>
+        </w:rPr>
+        <w:t xml:space="preserve"> </w:t>
+      </w:r>
+      <w:r>
+        <w:rPr>
+          <w:rFonts w:asciiTheme="majorHAnsi" w:hAnsiTheme="majorHAnsi" w:cstheme="majorHAnsi"/>
+          <w:color w:val="000000"/>
+          <w:sz w:val="22"/>
+          <w:szCs w:val="22"/>
+        </w:rPr>
+        <w:t>analys</w:t>
+      </w:r>
+      <w:r>
+        <w:rPr>
+          <w:rFonts w:asciiTheme="majorHAnsi" w:hAnsiTheme="majorHAnsi" w:cstheme="majorHAnsi"/>
+          <w:color w:val="000000"/>
+          <w:sz w:val="22"/>
+          <w:szCs w:val="22"/>
+        </w:rPr>
+        <w:t>e the</w:t>
+      </w:r>
+      <w:r>
+        <w:rPr>
+          <w:rFonts w:asciiTheme="majorHAnsi" w:hAnsiTheme="majorHAnsi" w:cstheme="majorHAnsi"/>
+          <w:color w:val="000000"/>
+          <w:sz w:val="22"/>
+          <w:szCs w:val="22"/>
+        </w:rPr>
+        <w:t xml:space="preserve"> session</w:t>
+      </w:r>
+      <w:r>
+        <w:rPr>
+          <w:rFonts w:asciiTheme="majorHAnsi" w:hAnsiTheme="majorHAnsi" w:cstheme="majorHAnsi"/>
+          <w:color w:val="000000"/>
+          <w:sz w:val="22"/>
+          <w:szCs w:val="22"/>
+        </w:rPr>
+        <w:t xml:space="preserve"> Lap by Lap,</w:t>
+      </w:r>
+      <w:r>
+        <w:rPr>
+          <w:rFonts w:asciiTheme="majorHAnsi" w:hAnsiTheme="majorHAnsi" w:cstheme="majorHAnsi"/>
+          <w:color w:val="000000"/>
+          <w:sz w:val="22"/>
+          <w:szCs w:val="22"/>
+        </w:rPr>
+        <w:t xml:space="preserve"> finds inefficient zones, grades battery risk, and surfaces the moments that mattered most during the </w:t>
+      </w:r>
+      <w:r>
+        <w:rPr>
+          <w:rFonts w:asciiTheme="majorHAnsi" w:hAnsiTheme="majorHAnsi" w:cstheme="majorHAnsi"/>
+          <w:color w:val="000000"/>
+          <w:sz w:val="22"/>
+          <w:szCs w:val="22"/>
+        </w:rPr>
+        <w:t>race</w:t>
+      </w:r>
+      <w:r>
+        <w:rPr>
+          <w:rFonts w:asciiTheme="majorHAnsi" w:hAnsiTheme="majorHAnsi" w:cstheme="majorHAnsi"/>
+          <w:color w:val="000000"/>
+          <w:sz w:val="22"/>
+          <w:szCs w:val="22"/>
+        </w:rPr>
+        <w:t>, not just a chart, but cause, consequence, recommendation, and evidence.</w:t>
+      </w:r>
+      <w:r>
+        <w:rPr>
+          <w:rFonts w:asciiTheme="majorHAnsi" w:hAnsiTheme="majorHAnsi" w:cstheme="majorHAnsi"/>
+          <w:color w:val="000000"/>
+          <w:sz w:val="22"/>
+          <w:szCs w:val="22"/>
+        </w:rPr>
+        <w:t xml:space="preserve">  </w:t>
+      </w:r>
+    </w:p>
+    <w:p>
+      <w:pPr>
+        <w:pStyle w:val="NormalWeb"/>
+        <w:spacing w:before="0" w:beforeAutospacing="0" w:after="0" w:afterAutospacing="0"/>
+        <w:rPr>
+          <w:rFonts w:asciiTheme="majorHAnsi" w:hAnsiTheme="majorHAnsi" w:cstheme="majorHAnsi"/>
+          <w:color w:val="000000"/>
+          <w:sz w:val="22"/>
+          <w:szCs w:val="22"/>
+        </w:rPr>
+      </w:pPr>
+    </w:p>
+    <w:p>
+      <w:pPr>
+        <w:pStyle w:val="NormalWeb"/>
+        <w:spacing w:before="0" w:beforeAutospacing="0" w:after="0" w:afterAutospacing="0"/>
+        <w:rPr>
+          <w:rFonts w:asciiTheme="majorHAnsi" w:hAnsiTheme="majorHAnsi" w:cstheme="majorHAnsi"/>
+        </w:rPr>
+      </w:pPr>
+      <w:r>
+        <w:rPr>
+          <w:rFonts w:asciiTheme="majorHAnsi" w:hAnsiTheme="majorHAnsi" w:cstheme="majorHAnsi"/>
+        </w:rPr>
+        <w:t>Click any zone Granite 4-h-small Instruct explains the cause, the consequence, and grounds its recommendation in the 2026 FIA technical regulations, parsed with Docling.</w:t>
+      </w:r>
+      <w:r>
+        <w:rPr>
+          <w:rFonts w:asciiTheme="majorHAnsi" w:hAnsiTheme="majorHAnsi" w:cstheme="majorHAnsi"/>
+        </w:rPr>
+        <w:t xml:space="preserve">  </w:t>
+      </w:r>
+    </w:p>
+    <w:p>
+      <w:pPr>
+        <w:pStyle w:val="NormalWeb"/>
+        <w:spacing w:before="0" w:beforeAutospacing="0" w:after="0" w:afterAutospacing="0"/>
+        <w:rPr>
+          <w:rFonts w:asciiTheme="majorHAnsi" w:hAnsiTheme="majorHAnsi" w:cstheme="majorHAnsi"/>
+        </w:rPr>
+      </w:pPr>
+      <w:r>
+        <w:rPr>
+          <w:rFonts w:asciiTheme="majorHAnsi" w:hAnsiTheme="majorHAnsi" w:cstheme="majorHAnsi"/>
+          <w:color w:val="000000"/>
+          <w:sz w:val="22"/>
+          <w:szCs w:val="22"/>
+        </w:rPr>
+        <w:t> </w:t>
+      </w:r>
+    </w:p>
+    <w:p>
+      <w:pPr>
+        <w:pStyle w:val="NormalWeb"/>
+        <w:spacing w:before="0" w:beforeAutospacing="0" w:after="0" w:afterAutospacing="0"/>
+        <w:rPr>
+          <w:rFonts w:asciiTheme="majorHAnsi" w:hAnsiTheme="majorHAnsi" w:cstheme="majorHAnsi"/>
+        </w:rPr>
+      </w:pPr>
+      <w:r>
+        <w:rPr>
+          <w:rFonts w:asciiTheme="majorHAnsi" w:hAnsiTheme="majorHAnsi" w:cstheme="majorHAnsi"/>
+          <w:b/>
+          <w:bCs/>
+          <w:color w:val="000000"/>
+          <w:sz w:val="22"/>
+          <w:szCs w:val="22"/>
+        </w:rPr>
+        <w:t>Segment 5 - Explainability</w:t>
+      </w:r>
+    </w:p>
+    <w:p>
+      <w:pPr>
+        <w:pStyle w:val="NormalWeb"/>
+        <w:spacing w:before="0" w:beforeAutospacing="0" w:after="0" w:afterAutospacing="0"/>
+        <w:rPr>
+          <w:rFonts w:asciiTheme="majorHAnsi" w:hAnsiTheme="majorHAnsi" w:cstheme="majorHAnsi"/>
+        </w:rPr>
+      </w:pPr>
+      <w:r>
+        <w:rPr>
+          <w:rFonts w:asciiTheme="majorHAnsi" w:hAnsiTheme="majorHAnsi" w:cstheme="majorHAnsi"/>
+          <w:color w:val="000000"/>
+          <w:sz w:val="22"/>
+          <w:szCs w:val="22"/>
+        </w:rPr>
+        <w:lastRenderedPageBreak/>
+        <w:t> </w:t>
+      </w:r>
+    </w:p>
+    <w:p>
+      <w:pPr>
+        <w:pStyle w:val="NormalWeb"/>
+        <w:spacing w:before="0" w:beforeAutospacing="0" w:after="0" w:afterAutospacing="0"/>
+        <w:rPr>
+          <w:rFonts w:asciiTheme="majorHAnsi" w:hAnsiTheme="majorHAnsi" w:cstheme="majorHAnsi"/>
+        </w:rPr>
+      </w:pPr>
+      <w:r>
+        <w:rPr>
+          <w:rFonts w:asciiTheme="majorHAnsi" w:hAnsiTheme="majorHAnsi" w:cstheme="majorHAnsi"/>
+          <w:color w:val="000000"/>
+          <w:sz w:val="22"/>
+          <w:szCs w:val="22"/>
+        </w:rPr>
+        <w:t>This is the trust layer. Every recommendation</w:t>
+      </w:r>
+      <w:r>
+        <w:rPr>
+          <w:rFonts w:asciiTheme="majorHAnsi" w:hAnsiTheme="majorHAnsi" w:cstheme="majorHAnsi"/>
+          <w:color w:val="000000"/>
+          <w:sz w:val="22"/>
+          <w:szCs w:val="22"/>
+        </w:rPr>
+        <w:t xml:space="preserve"> cites a verbatim clause</w:t>
+      </w:r>
+      <w:r>
+        <w:rPr>
+          <w:rFonts w:asciiTheme="majorHAnsi" w:hAnsiTheme="majorHAnsi" w:cstheme="majorHAnsi"/>
+          <w:color w:val="000000"/>
+          <w:sz w:val="22"/>
+          <w:szCs w:val="22"/>
+        </w:rPr>
+        <w:t xml:space="preserve"> grounded</w:t>
+      </w:r>
+      <w:r>
+        <w:rPr>
+          <w:rFonts w:asciiTheme="majorHAnsi" w:hAnsiTheme="majorHAnsi" w:cstheme="majorHAnsi"/>
+          <w:color w:val="000000"/>
+          <w:sz w:val="22"/>
+          <w:szCs w:val="22"/>
+        </w:rPr>
+        <w:t xml:space="preserve"> in a Docling-parsed </w:t>
+      </w:r>
+      <w:r>
+        <w:rPr>
+          <w:rFonts w:asciiTheme="majorHAnsi" w:hAnsiTheme="majorHAnsi" w:cstheme="majorHAnsi"/>
+          <w:color w:val="000000"/>
+          <w:sz w:val="22"/>
+          <w:szCs w:val="22"/>
+        </w:rPr>
+        <w:t xml:space="preserve">official </w:t>
+      </w:r>
+      <w:r>
+        <w:rPr>
+          <w:rFonts w:asciiTheme="majorHAnsi" w:hAnsiTheme="majorHAnsi" w:cstheme="majorHAnsi"/>
+          <w:color w:val="000000"/>
+          <w:sz w:val="22"/>
+          <w:szCs w:val="22"/>
+        </w:rPr>
+        <w:t>FI</w:t>
+      </w:r>
+      <w:r>
+        <w:rPr>
+          <w:rFonts w:asciiTheme="majorHAnsi" w:hAnsiTheme="majorHAnsi" w:cstheme="majorHAnsi"/>
+          <w:color w:val="000000"/>
+          <w:sz w:val="22"/>
+          <w:szCs w:val="22"/>
+        </w:rPr>
+        <w:t>A</w:t>
+      </w:r>
+      <w:r>
+        <w:rPr>
+          <w:rFonts w:asciiTheme="majorHAnsi" w:hAnsiTheme="majorHAnsi" w:cstheme="majorHAnsi"/>
+          <w:color w:val="000000"/>
+          <w:sz w:val="22"/>
+          <w:szCs w:val="22"/>
+        </w:rPr>
+        <w:t xml:space="preserve"> regulation passage. Pass one is deterministic validation. Pass two is Granite Guardian with custom safety criteria. If the system catches a malformed answer, it shows there was a failure instead of hiding it.</w:t>
+      </w:r>
+    </w:p>
+    <w:p>
+      <w:pPr>
+        <w:pStyle w:val="NormalWeb"/>
+        <w:spacing w:before="0" w:beforeAutospacing="0" w:after="0" w:afterAutospacing="0"/>
+        <w:rPr>
+          <w:rFonts w:asciiTheme="majorHAnsi" w:hAnsiTheme="majorHAnsi" w:cstheme="majorHAnsi"/>
+        </w:rPr>
+      </w:pPr>
+      <w:r>
+        <w:rPr>
+          <w:rFonts w:asciiTheme="majorHAnsi" w:hAnsiTheme="majorHAnsi" w:cstheme="majorHAnsi"/>
+          <w:color w:val="000000"/>
+          <w:sz w:val="22"/>
+          <w:szCs w:val="22"/>
+        </w:rPr>
+        <w:t> </w:t>
+      </w:r>
+    </w:p>
+    <w:p>
+      <w:pPr>
+        <w:pStyle w:val="NormalWeb"/>
+        <w:spacing w:before="0" w:beforeAutospacing="0" w:after="0" w:afterAutospacing="0"/>
+        <w:rPr>
+          <w:rFonts w:asciiTheme="majorHAnsi" w:hAnsiTheme="majorHAnsi" w:cstheme="majorHAnsi"/>
+        </w:rPr>
+      </w:pPr>
+      <w:r>
+        <w:rPr>
+          <w:rFonts w:asciiTheme="majorHAnsi" w:hAnsiTheme="majorHAnsi" w:cstheme="majorHAnsi"/>
+          <w:b/>
+          <w:bCs/>
+          <w:color w:val="000000"/>
+          <w:sz w:val="22"/>
+          <w:szCs w:val="22"/>
+        </w:rPr>
+        <w:t>Segment 6 - What-If and Fan Mode</w:t>
+      </w:r>
+    </w:p>
+    <w:p>
+      <w:pPr>
+        <w:pStyle w:val="NormalWeb"/>
+        <w:spacing w:before="0" w:beforeAutospacing="0" w:after="0" w:afterAutospacing="0"/>
+        <w:rPr>
+          <w:rFonts w:asciiTheme="majorHAnsi" w:hAnsiTheme="majorHAnsi" w:cstheme="majorHAnsi"/>
+        </w:rPr>
+      </w:pPr>
+      <w:r>
+        <w:rPr>
+          <w:rFonts w:asciiTheme="majorHAnsi" w:hAnsiTheme="majorHAnsi" w:cstheme="majorHAnsi"/>
+          <w:color w:val="000000"/>
+          <w:sz w:val="22"/>
+          <w:szCs w:val="22"/>
+        </w:rPr>
+        <w:t> </w:t>
+      </w:r>
+    </w:p>
+    <w:p>
+      <w:pPr>
+        <w:pStyle w:val="NormalWeb"/>
+        <w:spacing w:before="0" w:beforeAutospacing="0" w:after="0" w:afterAutospacing="0"/>
+        <w:rPr>
+          <w:rFonts w:asciiTheme="majorHAnsi" w:hAnsiTheme="majorHAnsi" w:cstheme="majorHAnsi"/>
+          <w:color w:val="000000"/>
+          <w:sz w:val="22"/>
+          <w:szCs w:val="22"/>
+        </w:rPr>
+      </w:pPr>
+      <w:r>
+        <w:rPr>
+          <w:rFonts w:asciiTheme="majorHAnsi" w:hAnsiTheme="majorHAnsi" w:cstheme="majorHAnsi"/>
+          <w:color w:val="000000"/>
+          <w:sz w:val="22"/>
+          <w:szCs w:val="22"/>
+        </w:rPr>
+        <w:t>Furthermore, Engineers can test a counterfactual and see the same pipeline rerun on alternate strategies. The Fan Mode feature of the application translates the same technical evidence into plain language, so teams, drivers, broadcasters, and fans can share the same explanation.</w:t>
+      </w:r>
+    </w:p>
+    <w:p>
+      <w:pPr>
+        <w:pStyle w:val="NormalWeb"/>
+        <w:spacing w:before="0" w:beforeAutospacing="0" w:after="0" w:afterAutospacing="0"/>
+        <w:rPr>
+          <w:rFonts w:asciiTheme="majorHAnsi" w:hAnsiTheme="majorHAnsi" w:cstheme="majorHAnsi"/>
+        </w:rPr>
+      </w:pPr>
+      <w:r>
+        <w:rPr>
+          <w:rFonts w:asciiTheme="majorHAnsi" w:hAnsiTheme="majorHAnsi" w:cstheme="majorHAnsi"/>
+          <w:color w:val="000000"/>
+          <w:sz w:val="22"/>
+          <w:szCs w:val="22"/>
+        </w:rPr>
+        <w:t> </w:t>
+      </w:r>
+    </w:p>
+    <w:p>
+      <w:pPr>
+        <w:pStyle w:val="NormalWeb"/>
+        <w:spacing w:before="0" w:beforeAutospacing="0" w:after="0" w:afterAutospacing="0"/>
+        <w:rPr>
+          <w:rFonts w:asciiTheme="majorHAnsi" w:hAnsiTheme="majorHAnsi" w:cstheme="majorHAnsi"/>
+        </w:rPr>
+      </w:pPr>
+      <w:r>
+        <w:rPr>
+          <w:rFonts w:asciiTheme="majorHAnsi" w:hAnsiTheme="majorHAnsi" w:cstheme="majorHAnsi"/>
+          <w:b/>
+          <w:bCs/>
+          <w:color w:val="000000"/>
+          <w:sz w:val="22"/>
+          <w:szCs w:val="22"/>
         </w:rPr>
         <w:t>Segment 7 - Close</w:t>
       </w:r>
@@ -985,61 +1111,25 @@
           <w:sz w:val="22"/>
           <w:szCs w:val="22"/>
         </w:rPr>
-        <w:t>Granite Instruct,</w:t>
-      </w:r>
-      <w:r>
-        <w:rPr>
-          <w:rFonts w:asciiTheme="majorHAnsi" w:hAnsiTheme="majorHAnsi" w:cstheme="majorHAnsi"/>
-          <w:color w:val="000000"/>
-          <w:sz w:val="22"/>
-          <w:szCs w:val="22"/>
-        </w:rPr>
-        <w:t xml:space="preserve"> Granite</w:t>
-      </w:r>
-      <w:r>
-        <w:rPr>
-          <w:rFonts w:asciiTheme="majorHAnsi" w:hAnsiTheme="majorHAnsi" w:cstheme="majorHAnsi"/>
-          <w:color w:val="000000"/>
-          <w:sz w:val="22"/>
-          <w:szCs w:val="22"/>
-        </w:rPr>
-        <w:t xml:space="preserve"> Guardian,</w:t>
-      </w:r>
-      <w:r>
-        <w:rPr>
-          <w:rFonts w:asciiTheme="majorHAnsi" w:hAnsiTheme="majorHAnsi" w:cstheme="majorHAnsi"/>
-          <w:color w:val="000000"/>
-          <w:sz w:val="22"/>
-          <w:szCs w:val="22"/>
-        </w:rPr>
-        <w:t xml:space="preserve"> Granite</w:t>
-      </w:r>
-      <w:r>
-        <w:rPr>
-          <w:rFonts w:asciiTheme="majorHAnsi" w:hAnsiTheme="majorHAnsi" w:cstheme="majorHAnsi"/>
-          <w:color w:val="000000"/>
-          <w:sz w:val="22"/>
-          <w:szCs w:val="22"/>
-        </w:rPr>
-        <w:t xml:space="preserve"> Embedding,</w:t>
-      </w:r>
-      <w:r>
-        <w:rPr>
-          <w:rFonts w:asciiTheme="majorHAnsi" w:hAnsiTheme="majorHAnsi" w:cstheme="majorHAnsi"/>
-          <w:color w:val="000000"/>
-          <w:sz w:val="22"/>
-          <w:szCs w:val="22"/>
-        </w:rPr>
-        <w:t xml:space="preserve"> Granite</w:t>
-      </w:r>
-      <w:r>
-        <w:rPr>
-          <w:rFonts w:asciiTheme="majorHAnsi" w:hAnsiTheme="majorHAnsi" w:cstheme="majorHAnsi"/>
-          <w:color w:val="000000"/>
-          <w:sz w:val="22"/>
-          <w:szCs w:val="22"/>
-        </w:rPr>
-        <w:t xml:space="preserve"> TTM-R2</w:t>
+        <w:t>Granite Instruct, Guardian, Embedding,</w:t>
+      </w:r>
+      <w:r>
+        <w:rPr>
+          <w:rFonts w:asciiTheme="majorHAnsi" w:hAnsiTheme="majorHAnsi" w:cstheme="majorHAnsi"/>
+          <w:color w:val="000000"/>
+          <w:sz w:val="22"/>
+          <w:szCs w:val="22"/>
+        </w:rPr>
+        <w:t xml:space="preserve"> </w:t>
+      </w:r>
+      <w:r>
+        <w:rPr>
+          <w:rFonts w:asciiTheme="majorHAnsi" w:hAnsiTheme="majorHAnsi" w:cstheme="majorHAnsi"/>
+          <w:color w:val="000000"/>
+          <w:sz w:val="22"/>
+          <w:szCs w:val="22"/>
+        </w:rPr>
+        <w:t>TTM-R2</w:t>
       </w:r>
       <w:r>
         <w:rPr>
@@ -1113,63 +1203,6 @@
         </w:rPr>
         <w:t xml:space="preserve"> era.</w:t>
       </w:r>
-    </w:p>
-    <w:p>
-      <w:pPr>
-        <w:rPr>
-          <w:rFonts w:asciiTheme="majorHAnsi" w:eastAsia="Quattrocento Sans" w:hAnsiTheme="majorHAnsi" w:cstheme="majorHAnsi"/>
-          <w:lang w:val="en-CA"/>
-        </w:rPr>
-      </w:pPr>
-    </w:p>
-    <w:p>
-      <w:pPr>
-        <w:rPr>
-          <w:rFonts w:asciiTheme="majorHAnsi" w:eastAsia="Quattrocento Sans" w:hAnsiTheme="majorHAnsi" w:cstheme="majorHAnsi"/>
-          <w:lang w:val="en-CA"/>
-        </w:rPr>
-      </w:pPr>
-    </w:p>
-    <w:p>
-      <w:pPr>
-        <w:rPr>
-          <w:rFonts w:asciiTheme="majorHAnsi" w:eastAsia="Quattrocento Sans" w:hAnsiTheme="majorHAnsi" w:cstheme="majorHAnsi"/>
-        </w:rPr>
-      </w:pPr>
-      <w:r>
-        <w:rPr>
-          <w:rFonts w:asciiTheme="majorHAnsi" w:eastAsia="Quattrocento Sans" w:hAnsiTheme="majorHAnsi" w:cstheme="majorHAnsi"/>
-        </w:rPr>
-        <w:br w:type="page"/>
-      </w:r>
-    </w:p>
-    <w:p>
-      <w:pPr>
-        <w:rPr>
-          <w:rFonts w:asciiTheme="majorHAnsi" w:eastAsia="Quattrocento Sans" w:hAnsiTheme="majorHAnsi" w:cstheme="majorHAnsi"/>
-        </w:rPr>
-      </w:pPr>
-    </w:p>
-    <w:p>
-      <w:pPr>
-        <w:rPr>
-          <w:rFonts w:asciiTheme="majorHAnsi" w:eastAsia="Quattrocento Sans" w:hAnsiTheme="majorHAnsi" w:cstheme="majorHAnsi"/>
-        </w:rPr>
-      </w:pPr>
-    </w:p>
-    <w:p>
-      <w:pPr>
-        <w:rPr>
-          <w:rFonts w:asciiTheme="majorHAnsi" w:eastAsia="Quattrocento Sans" w:hAnsiTheme="majorHAnsi" w:cstheme="majorHAnsi"/>
-        </w:rPr>
-      </w:pPr>
-    </w:p>
-    <w:p>
-      <w:pPr>
-        <w:rPr>
-          <w:rFonts w:asciiTheme="majorHAnsi" w:eastAsia="Quattrocento Sans" w:hAnsiTheme="majorHAnsi" w:cstheme="majorHAnsi"/>
-        </w:rPr>
-      </w:pPr>
     </w:p>
     <w:sectPr>
       <w:pgSz w:w="12240" w:h="15840"/>
@@ -1768,7 +1801,6 @@
     <w:name w:val="Normal (Web)"/>
     <w:basedOn w:val="Normal"/>
     <w:uiPriority w:val="99"/>
-    <w:semiHidden/>
     <w:unhideWhenUsed/>
     <w:rsid w:val="00920CEC"/>
     <w:pPr>

</xml_diff>